<commit_message>
fix: hapus garis tabel, buat stempel menimpa ttd secara alami, dan perbaiki pratinjau surat
</commit_message>
<xml_diff>
--- a/public/templates/SKTM.docx
+++ b/public/templates/SKTM.docx
@@ -6,12 +6,12 @@
       <w:tblPr>
         <w:tblW w:type="dxa" w:w="9000"/>
         <w:tblBorders>
-          <w:top w:val="single" w:color="auto" w:sz="4"/>
-          <w:left w:val="single" w:color="auto" w:sz="4"/>
-          <w:bottom w:val="single" w:color="auto" w:sz="4"/>
-          <w:right w:val="single" w:color="auto" w:sz="4"/>
-          <w:insideH w:val="single" w:color="auto" w:sz="4"/>
-          <w:insideV w:val="single" w:color="auto" w:sz="4"/>
+          <w:top w:val="none" w:color="auto" w:sz="0"/>
+          <w:left w:val="none" w:color="auto" w:sz="0"/>
+          <w:bottom w:val="none" w:color="auto" w:sz="0"/>
+          <w:right w:val="none" w:color="auto" w:sz="0"/>
+          <w:insideH w:val="none" w:color="auto" w:sz="0"/>
+          <w:insideV w:val="none" w:color="auto" w:sz="0"/>
         </w:tblBorders>
       </w:tblPr>
       <w:tblGrid>
@@ -23,10 +23,10 @@
           <w:tcPr>
             <w:tcW w:type="dxa" w:w="1600"/>
             <w:tcBorders>
-              <w:top w:val="none"/>
-              <w:left w:val="none"/>
-              <w:bottom w:val="none"/>
-              <w:right w:val="none"/>
+              <w:top w:val="none" w:color="auto" w:sz="0"/>
+              <w:left w:val="none" w:color="auto" w:sz="0"/>
+              <w:bottom w:val="none" w:color="auto" w:sz="0"/>
+              <w:right w:val="none" w:color="auto" w:sz="0"/>
             </w:tcBorders>
             <w:vAlign w:val="center"/>
           </w:tcPr>
@@ -80,10 +80,10 @@
           <w:tcPr>
             <w:tcW w:type="dxa" w:w="7400"/>
             <w:tcBorders>
-              <w:top w:val="none"/>
-              <w:left w:val="none"/>
-              <w:bottom w:val="none"/>
-              <w:right w:val="none"/>
+              <w:top w:val="none" w:color="auto" w:sz="0"/>
+              <w:left w:val="none" w:color="auto" w:sz="0"/>
+              <w:bottom w:val="none" w:color="auto" w:sz="0"/>
+              <w:right w:val="none" w:color="auto" w:sz="0"/>
             </w:tcBorders>
             <w:vAlign w:val="center"/>
           </w:tcPr>
@@ -212,12 +212,12 @@
       <w:tblPr>
         <w:tblW w:type="dxa" w:w="9000"/>
         <w:tblBorders>
-          <w:top w:val="single" w:color="auto" w:sz="4"/>
-          <w:left w:val="single" w:color="auto" w:sz="4"/>
-          <w:bottom w:val="single" w:color="auto" w:sz="4"/>
-          <w:right w:val="single" w:color="auto" w:sz="4"/>
-          <w:insideH w:val="single" w:color="auto" w:sz="4"/>
-          <w:insideV w:val="single" w:color="auto" w:sz="4"/>
+          <w:top w:val="none" w:color="auto" w:sz="0"/>
+          <w:left w:val="none" w:color="auto" w:sz="0"/>
+          <w:bottom w:val="none" w:color="auto" w:sz="0"/>
+          <w:right w:val="none" w:color="auto" w:sz="0"/>
+          <w:insideH w:val="none" w:color="auto" w:sz="0"/>
+          <w:insideV w:val="none" w:color="auto" w:sz="0"/>
         </w:tblBorders>
       </w:tblPr>
       <w:tblGrid>
@@ -230,10 +230,10 @@
           <w:tcPr>
             <w:tcW w:type="dxa" w:w="3000"/>
             <w:tcBorders>
-              <w:top w:val="none"/>
-              <w:left w:val="none"/>
-              <w:bottom w:val="none"/>
-              <w:right w:val="none"/>
+              <w:top w:val="none" w:color="auto" w:sz="0"/>
+              <w:left w:val="none" w:color="auto" w:sz="0"/>
+              <w:bottom w:val="none" w:color="auto" w:sz="0"/>
+              <w:right w:val="none" w:color="auto" w:sz="0"/>
             </w:tcBorders>
           </w:tcPr>
           <w:p>
@@ -254,10 +254,10 @@
           <w:tcPr>
             <w:tcW w:type="dxa" w:w="400"/>
             <w:tcBorders>
-              <w:top w:val="none"/>
-              <w:left w:val="none"/>
-              <w:bottom w:val="none"/>
-              <w:right w:val="none"/>
+              <w:top w:val="none" w:color="auto" w:sz="0"/>
+              <w:left w:val="none" w:color="auto" w:sz="0"/>
+              <w:bottom w:val="none" w:color="auto" w:sz="0"/>
+              <w:right w:val="none" w:color="auto" w:sz="0"/>
             </w:tcBorders>
           </w:tcPr>
           <w:p>
@@ -278,10 +278,10 @@
           <w:tcPr>
             <w:tcW w:type="dxa" w:w="5600"/>
             <w:tcBorders>
-              <w:top w:val="none"/>
-              <w:left w:val="none"/>
-              <w:bottom w:val="none"/>
-              <w:right w:val="none"/>
+              <w:top w:val="none" w:color="auto" w:sz="0"/>
+              <w:left w:val="none" w:color="auto" w:sz="0"/>
+              <w:bottom w:val="none" w:color="auto" w:sz="0"/>
+              <w:right w:val="none" w:color="auto" w:sz="0"/>
             </w:tcBorders>
           </w:tcPr>
           <w:p>
@@ -306,10 +306,10 @@
           <w:tcPr>
             <w:tcW w:type="dxa" w:w="3000"/>
             <w:tcBorders>
-              <w:top w:val="none"/>
-              <w:left w:val="none"/>
-              <w:bottom w:val="none"/>
-              <w:right w:val="none"/>
+              <w:top w:val="none" w:color="auto" w:sz="0"/>
+              <w:left w:val="none" w:color="auto" w:sz="0"/>
+              <w:bottom w:val="none" w:color="auto" w:sz="0"/>
+              <w:right w:val="none" w:color="auto" w:sz="0"/>
             </w:tcBorders>
           </w:tcPr>
           <w:p>
@@ -330,10 +330,10 @@
           <w:tcPr>
             <w:tcW w:type="dxa" w:w="400"/>
             <w:tcBorders>
-              <w:top w:val="none"/>
-              <w:left w:val="none"/>
-              <w:bottom w:val="none"/>
-              <w:right w:val="none"/>
+              <w:top w:val="none" w:color="auto" w:sz="0"/>
+              <w:left w:val="none" w:color="auto" w:sz="0"/>
+              <w:bottom w:val="none" w:color="auto" w:sz="0"/>
+              <w:right w:val="none" w:color="auto" w:sz="0"/>
             </w:tcBorders>
           </w:tcPr>
           <w:p>
@@ -354,10 +354,10 @@
           <w:tcPr>
             <w:tcW w:type="dxa" w:w="5600"/>
             <w:tcBorders>
-              <w:top w:val="none"/>
-              <w:left w:val="none"/>
-              <w:bottom w:val="none"/>
-              <w:right w:val="none"/>
+              <w:top w:val="none" w:color="auto" w:sz="0"/>
+              <w:left w:val="none" w:color="auto" w:sz="0"/>
+              <w:bottom w:val="none" w:color="auto" w:sz="0"/>
+              <w:right w:val="none" w:color="auto" w:sz="0"/>
             </w:tcBorders>
           </w:tcPr>
           <w:p>
@@ -382,10 +382,10 @@
           <w:tcPr>
             <w:tcW w:type="dxa" w:w="3000"/>
             <w:tcBorders>
-              <w:top w:val="none"/>
-              <w:left w:val="none"/>
-              <w:bottom w:val="none"/>
-              <w:right w:val="none"/>
+              <w:top w:val="none" w:color="auto" w:sz="0"/>
+              <w:left w:val="none" w:color="auto" w:sz="0"/>
+              <w:bottom w:val="none" w:color="auto" w:sz="0"/>
+              <w:right w:val="none" w:color="auto" w:sz="0"/>
             </w:tcBorders>
           </w:tcPr>
           <w:p>
@@ -406,10 +406,10 @@
           <w:tcPr>
             <w:tcW w:type="dxa" w:w="400"/>
             <w:tcBorders>
-              <w:top w:val="none"/>
-              <w:left w:val="none"/>
-              <w:bottom w:val="none"/>
-              <w:right w:val="none"/>
+              <w:top w:val="none" w:color="auto" w:sz="0"/>
+              <w:left w:val="none" w:color="auto" w:sz="0"/>
+              <w:bottom w:val="none" w:color="auto" w:sz="0"/>
+              <w:right w:val="none" w:color="auto" w:sz="0"/>
             </w:tcBorders>
           </w:tcPr>
           <w:p>
@@ -430,10 +430,10 @@
           <w:tcPr>
             <w:tcW w:type="dxa" w:w="5600"/>
             <w:tcBorders>
-              <w:top w:val="none"/>
-              <w:left w:val="none"/>
-              <w:bottom w:val="none"/>
-              <w:right w:val="none"/>
+              <w:top w:val="none" w:color="auto" w:sz="0"/>
+              <w:left w:val="none" w:color="auto" w:sz="0"/>
+              <w:bottom w:val="none" w:color="auto" w:sz="0"/>
+              <w:right w:val="none" w:color="auto" w:sz="0"/>
             </w:tcBorders>
           </w:tcPr>
           <w:p>
@@ -458,10 +458,10 @@
           <w:tcPr>
             <w:tcW w:type="dxa" w:w="3000"/>
             <w:tcBorders>
-              <w:top w:val="none"/>
-              <w:left w:val="none"/>
-              <w:bottom w:val="none"/>
-              <w:right w:val="none"/>
+              <w:top w:val="none" w:color="auto" w:sz="0"/>
+              <w:left w:val="none" w:color="auto" w:sz="0"/>
+              <w:bottom w:val="none" w:color="auto" w:sz="0"/>
+              <w:right w:val="none" w:color="auto" w:sz="0"/>
             </w:tcBorders>
           </w:tcPr>
           <w:p>
@@ -482,10 +482,10 @@
           <w:tcPr>
             <w:tcW w:type="dxa" w:w="400"/>
             <w:tcBorders>
-              <w:top w:val="none"/>
-              <w:left w:val="none"/>
-              <w:bottom w:val="none"/>
-              <w:right w:val="none"/>
+              <w:top w:val="none" w:color="auto" w:sz="0"/>
+              <w:left w:val="none" w:color="auto" w:sz="0"/>
+              <w:bottom w:val="none" w:color="auto" w:sz="0"/>
+              <w:right w:val="none" w:color="auto" w:sz="0"/>
             </w:tcBorders>
           </w:tcPr>
           <w:p>
@@ -506,10 +506,10 @@
           <w:tcPr>
             <w:tcW w:type="dxa" w:w="5600"/>
             <w:tcBorders>
-              <w:top w:val="none"/>
-              <w:left w:val="none"/>
-              <w:bottom w:val="none"/>
-              <w:right w:val="none"/>
+              <w:top w:val="none" w:color="auto" w:sz="0"/>
+              <w:left w:val="none" w:color="auto" w:sz="0"/>
+              <w:bottom w:val="none" w:color="auto" w:sz="0"/>
+              <w:right w:val="none" w:color="auto" w:sz="0"/>
             </w:tcBorders>
           </w:tcPr>
           <w:p>
@@ -596,7 +596,7 @@
       <w:r>
         <w:drawing>
           <wp:inline distT="0" distB="0" distL="0" distR="0">
-            <wp:extent cx="857250" cy="857250"/>
+            <wp:extent cx="1666875" cy="809625"/>
             <wp:effectExtent t="0" r="0" b="0" l="0"/>
             <wp:docPr id="1" name="" descr="" title=""/>
             <wp:cNvGraphicFramePr>
@@ -621,47 +621,7 @@
                   <pic:spPr bwMode="auto">
                     <a:xfrm>
                       <a:off x="0" y="0"/>
-                      <a:ext cx="857250" cy="857250"/>
-                    </a:xfrm>
-                    <a:prstGeom prst="rect">
-                      <a:avLst/>
-                    </a:prstGeom>
-                  </pic:spPr>
-                </pic:pic>
-              </a:graphicData>
-            </a:graphic>
-          </wp:inline>
-        </w:drawing>
-      </w:r>
-      <w:r>
-        <w:drawing>
-          <wp:inline distT="0" distB="0" distL="0" distR="0">
-            <wp:extent cx="1238250" cy="619125"/>
-            <wp:effectExtent t="0" r="0" b="0" l="0"/>
-            <wp:docPr id="1" name="" descr="" title=""/>
-            <wp:cNvGraphicFramePr>
-              <a:graphicFrameLocks xmlns:a="http://schemas.openxmlformats.org/drawingml/2006/main" noChangeAspect="1"/>
-            </wp:cNvGraphicFramePr>
-            <a:graphic xmlns:a="http://schemas.openxmlformats.org/drawingml/2006/main">
-              <a:graphicData uri="http://schemas.openxmlformats.org/drawingml/2006/picture">
-                <pic:pic xmlns:pic="http://schemas.openxmlformats.org/drawingml/2006/picture">
-                  <pic:nvPicPr>
-                    <pic:cNvPr id="0" name="" descr=""/>
-                    <pic:cNvPicPr>
-                      <a:picLocks noChangeAspect="1" noChangeArrowheads="1"/>
-                    </pic:cNvPicPr>
-                  </pic:nvPicPr>
-                  <pic:blipFill>
-                    <a:blip r:embed="rId9" cstate="none"/>
-                    <a:srcRect/>
-                    <a:stretch>
-                      <a:fillRect/>
-                    </a:stretch>
-                  </pic:blipFill>
-                  <pic:spPr bwMode="auto">
-                    <a:xfrm>
-                      <a:off x="0" y="0"/>
-                      <a:ext cx="1238250" cy="619125"/>
+                      <a:ext cx="1666875" cy="809625"/>
                     </a:xfrm>
                     <a:prstGeom prst="rect">
                       <a:avLst/>

</xml_diff>